<commit_message>
Plots added-with the paper in the extra-phase get the paper from there.!
</commit_message>
<xml_diff>
--- a/trust_fin_extra_phase/paper/TrustFin_Conference_Paper_IEEE.docx
+++ b/trust_fin_extra_phase/paper/TrustFin_Conference_Paper_IEEE.docx
@@ -8275,16 +8275,6 @@
       <w:r>
         <w:t xml:space="preserve">the declared next step.</w:t>
       </w:r>
-    </w:p>
-    <w:p>
-      <w:pPr>
-        <w:pStyle w:val="Heading1"/>
-      </w:pPr>
-      <w:bookmarkStart w:id="76" w:name="_references"/>
-      <w:r>
-        <w:t xml:space="preserve">References</w:t>
-      </w:r>
-      <w:bookmarkEnd w:id="76"/>
     </w:p>
     <w:p>
       <w:pPr>

</xml_diff>